<commit_message>
LAB4: mở rộng báo cáo - thêm bảng kê 23 cổng, UDP chi tiết, OS/traceroute, ánh xạ CVE, phân tích và khuyến nghị phòng thủ
</commit_message>
<xml_diff>
--- a/LAB4/Lab4_11CNPM2_1150080120_HoangThanhTra.docx
+++ b/LAB4/Lab4_11CNPM2_1150080120_HoangThanhTra.docx
@@ -3105,6 +3105,2460 @@
           <w:i w:val="0"/>
         </w:rPr>
         <w:t>Quét nmap -sS -p- phát hiện 30 cổng open. Các cổng nằm ngoài 1000 cổng mặc định gồm: 3632 (distccd), 6697 (ircs), 8180 (Tomcat), 8787 (msgsrvr của Ruby DRb) và các cổng RPC động cao 37985, 39083, 47519, 58459. Đây là lý do cần quét đầy đủ khi tìm backdoor hoặc dịch vụ trái phép.</w:t>
+      </w:r>
+    </w:p>
+    <w:p>
+      <w:r>
+        <w:rPr>
+          <w:b/>
+          <w:i w:val="0"/>
+          <w:sz w:val="26"/>
+        </w:rPr>
+        <w:t>J. BẢNG KÊ ĐẦY ĐỦ 23 CỔNG TCP MỞ (nmap -sV)</w:t>
+      </w:r>
+    </w:p>
+    <w:p>
+      <w:r>
+        <w:rPr>
+          <w:b w:val="0"/>
+          <w:i w:val="0"/>
+        </w:rPr>
+        <w:t>Toàn bộ dịch vụ và phiên bản Nmap nhận diện trên Metasploitable 2 (192.168.226.134):</w:t>
+      </w:r>
+    </w:p>
+    <w:tbl>
+      <w:tblPr>
+        <w:tblW w:type="auto" w:w="0"/>
+        <w:tblLook w:firstColumn="1" w:firstRow="1" w:lastColumn="0" w:lastRow="0" w:noHBand="0" w:noVBand="1" w:val="04A0"/>
+        <w:tblBorders>
+          <w:top w:val="single" w:sz="4" w:space="0" w:color="000000"/>
+          <w:left w:val="single" w:sz="4" w:space="0" w:color="000000"/>
+          <w:bottom w:val="single" w:sz="4" w:space="0" w:color="000000"/>
+          <w:right w:val="single" w:sz="4" w:space="0" w:color="000000"/>
+          <w:insideH w:val="single" w:sz="4" w:space="0" w:color="000000"/>
+          <w:insideV w:val="single" w:sz="4" w:space="0" w:color="000000"/>
+        </w:tblBorders>
+      </w:tblPr>
+      <w:tblGrid>
+        <w:gridCol w:w="2076"/>
+        <w:gridCol w:w="2076"/>
+        <w:gridCol w:w="2076"/>
+        <w:gridCol w:w="2076"/>
+      </w:tblGrid>
+      <w:tr>
+        <w:tc>
+          <w:tcPr>
+            <w:tcW w:type="dxa" w:w="2076"/>
+          </w:tcPr>
+          <w:p>
+            <w:r/>
+            <w:r>
+              <w:rPr>
+                <w:b/>
+                <w:sz w:val="18"/>
+              </w:rPr>
+              <w:t>Port</w:t>
+            </w:r>
+          </w:p>
+        </w:tc>
+        <w:tc>
+          <w:tcPr>
+            <w:tcW w:type="dxa" w:w="2076"/>
+          </w:tcPr>
+          <w:p>
+            <w:r/>
+            <w:r>
+              <w:rPr>
+                <w:b/>
+                <w:sz w:val="18"/>
+              </w:rPr>
+              <w:t>Service</w:t>
+            </w:r>
+          </w:p>
+        </w:tc>
+        <w:tc>
+          <w:tcPr>
+            <w:tcW w:type="dxa" w:w="2076"/>
+          </w:tcPr>
+          <w:p>
+            <w:r/>
+            <w:r>
+              <w:rPr>
+                <w:b/>
+                <w:sz w:val="18"/>
+              </w:rPr>
+              <w:t>Phiên bản</w:t>
+            </w:r>
+          </w:p>
+        </w:tc>
+        <w:tc>
+          <w:tcPr>
+            <w:tcW w:type="dxa" w:w="2076"/>
+          </w:tcPr>
+          <w:p>
+            <w:r/>
+            <w:r>
+              <w:rPr>
+                <w:b/>
+                <w:sz w:val="18"/>
+              </w:rPr>
+              <w:t>Ghi chú an toàn</w:t>
+            </w:r>
+          </w:p>
+        </w:tc>
+      </w:tr>
+      <w:tr>
+        <w:tc>
+          <w:tcPr>
+            <w:tcW w:type="dxa" w:w="2076"/>
+          </w:tcPr>
+          <w:p>
+            <w:r/>
+            <w:r>
+              <w:rPr>
+                <w:sz w:val="18"/>
+              </w:rPr>
+              <w:t>21/tcp</w:t>
+            </w:r>
+          </w:p>
+        </w:tc>
+        <w:tc>
+          <w:tcPr>
+            <w:tcW w:type="dxa" w:w="2076"/>
+          </w:tcPr>
+          <w:p>
+            <w:r/>
+            <w:r>
+              <w:rPr>
+                <w:sz w:val="18"/>
+              </w:rPr>
+              <w:t>ftp</w:t>
+            </w:r>
+          </w:p>
+        </w:tc>
+        <w:tc>
+          <w:tcPr>
+            <w:tcW w:type="dxa" w:w="2076"/>
+          </w:tcPr>
+          <w:p>
+            <w:r/>
+            <w:r>
+              <w:rPr>
+                <w:sz w:val="18"/>
+              </w:rPr>
+              <w:t>vsftpd 2.3.4</w:t>
+            </w:r>
+          </w:p>
+        </w:tc>
+        <w:tc>
+          <w:tcPr>
+            <w:tcW w:type="dxa" w:w="2076"/>
+          </w:tcPr>
+          <w:p>
+            <w:r/>
+            <w:r>
+              <w:rPr>
+                <w:sz w:val="18"/>
+              </w:rPr>
+              <w:t>Có backdoor (CVE-2011-2523)</w:t>
+            </w:r>
+          </w:p>
+        </w:tc>
+      </w:tr>
+      <w:tr>
+        <w:tc>
+          <w:tcPr>
+            <w:tcW w:type="dxa" w:w="2076"/>
+          </w:tcPr>
+          <w:p>
+            <w:r/>
+            <w:r>
+              <w:rPr>
+                <w:sz w:val="18"/>
+              </w:rPr>
+              <w:t>22/tcp</w:t>
+            </w:r>
+          </w:p>
+        </w:tc>
+        <w:tc>
+          <w:tcPr>
+            <w:tcW w:type="dxa" w:w="2076"/>
+          </w:tcPr>
+          <w:p>
+            <w:r/>
+            <w:r>
+              <w:rPr>
+                <w:sz w:val="18"/>
+              </w:rPr>
+              <w:t>ssh</w:t>
+            </w:r>
+          </w:p>
+        </w:tc>
+        <w:tc>
+          <w:tcPr>
+            <w:tcW w:type="dxa" w:w="2076"/>
+          </w:tcPr>
+          <w:p>
+            <w:r/>
+            <w:r>
+              <w:rPr>
+                <w:sz w:val="18"/>
+              </w:rPr>
+              <w:t>OpenSSH 4.7p1 Debian 8ubuntu1</w:t>
+            </w:r>
+          </w:p>
+        </w:tc>
+        <w:tc>
+          <w:tcPr>
+            <w:tcW w:type="dxa" w:w="2076"/>
+          </w:tcPr>
+          <w:p>
+            <w:r/>
+            <w:r>
+              <w:rPr>
+                <w:sz w:val="18"/>
+              </w:rPr>
+              <w:t>Phiên bản rất cũ</w:t>
+            </w:r>
+          </w:p>
+        </w:tc>
+      </w:tr>
+      <w:tr>
+        <w:tc>
+          <w:tcPr>
+            <w:tcW w:type="dxa" w:w="2076"/>
+          </w:tcPr>
+          <w:p>
+            <w:r/>
+            <w:r>
+              <w:rPr>
+                <w:sz w:val="18"/>
+              </w:rPr>
+              <w:t>23/tcp</w:t>
+            </w:r>
+          </w:p>
+        </w:tc>
+        <w:tc>
+          <w:tcPr>
+            <w:tcW w:type="dxa" w:w="2076"/>
+          </w:tcPr>
+          <w:p>
+            <w:r/>
+            <w:r>
+              <w:rPr>
+                <w:sz w:val="18"/>
+              </w:rPr>
+              <w:t>telnet</w:t>
+            </w:r>
+          </w:p>
+        </w:tc>
+        <w:tc>
+          <w:tcPr>
+            <w:tcW w:type="dxa" w:w="2076"/>
+          </w:tcPr>
+          <w:p>
+            <w:r/>
+            <w:r>
+              <w:rPr>
+                <w:sz w:val="18"/>
+              </w:rPr>
+              <w:t>Linux telnetd</w:t>
+            </w:r>
+          </w:p>
+        </w:tc>
+        <w:tc>
+          <w:tcPr>
+            <w:tcW w:type="dxa" w:w="2076"/>
+          </w:tcPr>
+          <w:p>
+            <w:r/>
+            <w:r>
+              <w:rPr>
+                <w:sz w:val="18"/>
+              </w:rPr>
+              <w:t>Truyền rõ, nên thay bằng SSH</w:t>
+            </w:r>
+          </w:p>
+        </w:tc>
+      </w:tr>
+      <w:tr>
+        <w:tc>
+          <w:tcPr>
+            <w:tcW w:type="dxa" w:w="2076"/>
+          </w:tcPr>
+          <w:p>
+            <w:r/>
+            <w:r>
+              <w:rPr>
+                <w:sz w:val="18"/>
+              </w:rPr>
+              <w:t>25/tcp</w:t>
+            </w:r>
+          </w:p>
+        </w:tc>
+        <w:tc>
+          <w:tcPr>
+            <w:tcW w:type="dxa" w:w="2076"/>
+          </w:tcPr>
+          <w:p>
+            <w:r/>
+            <w:r>
+              <w:rPr>
+                <w:sz w:val="18"/>
+              </w:rPr>
+              <w:t>smtp</w:t>
+            </w:r>
+          </w:p>
+        </w:tc>
+        <w:tc>
+          <w:tcPr>
+            <w:tcW w:type="dxa" w:w="2076"/>
+          </w:tcPr>
+          <w:p>
+            <w:r/>
+            <w:r>
+              <w:rPr>
+                <w:sz w:val="18"/>
+              </w:rPr>
+              <w:t>Postfix smtpd</w:t>
+            </w:r>
+          </w:p>
+        </w:tc>
+        <w:tc>
+          <w:tcPr>
+            <w:tcW w:type="dxa" w:w="2076"/>
+          </w:tcPr>
+          <w:p>
+            <w:r/>
+            <w:r>
+              <w:rPr>
+                <w:sz w:val="18"/>
+              </w:rPr>
+              <w:t>Mail server đời cũ</w:t>
+            </w:r>
+          </w:p>
+        </w:tc>
+      </w:tr>
+      <w:tr>
+        <w:tc>
+          <w:tcPr>
+            <w:tcW w:type="dxa" w:w="2076"/>
+          </w:tcPr>
+          <w:p>
+            <w:r/>
+            <w:r>
+              <w:rPr>
+                <w:sz w:val="18"/>
+              </w:rPr>
+              <w:t>53/tcp</w:t>
+            </w:r>
+          </w:p>
+        </w:tc>
+        <w:tc>
+          <w:tcPr>
+            <w:tcW w:type="dxa" w:w="2076"/>
+          </w:tcPr>
+          <w:p>
+            <w:r/>
+            <w:r>
+              <w:rPr>
+                <w:sz w:val="18"/>
+              </w:rPr>
+              <w:t>domain</w:t>
+            </w:r>
+          </w:p>
+        </w:tc>
+        <w:tc>
+          <w:tcPr>
+            <w:tcW w:type="dxa" w:w="2076"/>
+          </w:tcPr>
+          <w:p>
+            <w:r/>
+            <w:r>
+              <w:rPr>
+                <w:sz w:val="18"/>
+              </w:rPr>
+              <w:t>ISC BIND 9.4.2</w:t>
+            </w:r>
+          </w:p>
+        </w:tc>
+        <w:tc>
+          <w:tcPr>
+            <w:tcW w:type="dxa" w:w="2076"/>
+          </w:tcPr>
+          <w:p>
+            <w:r/>
+            <w:r>
+              <w:rPr>
+                <w:sz w:val="18"/>
+              </w:rPr>
+              <w:t>DNS cũ, nhiều CVE</w:t>
+            </w:r>
+          </w:p>
+        </w:tc>
+      </w:tr>
+      <w:tr>
+        <w:tc>
+          <w:tcPr>
+            <w:tcW w:type="dxa" w:w="2076"/>
+          </w:tcPr>
+          <w:p>
+            <w:r/>
+            <w:r>
+              <w:rPr>
+                <w:sz w:val="18"/>
+              </w:rPr>
+              <w:t>80/tcp</w:t>
+            </w:r>
+          </w:p>
+        </w:tc>
+        <w:tc>
+          <w:tcPr>
+            <w:tcW w:type="dxa" w:w="2076"/>
+          </w:tcPr>
+          <w:p>
+            <w:r/>
+            <w:r>
+              <w:rPr>
+                <w:sz w:val="18"/>
+              </w:rPr>
+              <w:t>http</w:t>
+            </w:r>
+          </w:p>
+        </w:tc>
+        <w:tc>
+          <w:tcPr>
+            <w:tcW w:type="dxa" w:w="2076"/>
+          </w:tcPr>
+          <w:p>
+            <w:r/>
+            <w:r>
+              <w:rPr>
+                <w:sz w:val="18"/>
+              </w:rPr>
+              <w:t>Apache httpd 2.2.8 (Ubuntu) DAV/2</w:t>
+            </w:r>
+          </w:p>
+        </w:tc>
+        <w:tc>
+          <w:tcPr>
+            <w:tcW w:type="dxa" w:w="2076"/>
+          </w:tcPr>
+          <w:p>
+            <w:r/>
+            <w:r>
+              <w:rPr>
+                <w:sz w:val="18"/>
+              </w:rPr>
+              <w:t>Web server EOL</w:t>
+            </w:r>
+          </w:p>
+        </w:tc>
+      </w:tr>
+      <w:tr>
+        <w:tc>
+          <w:tcPr>
+            <w:tcW w:type="dxa" w:w="2076"/>
+          </w:tcPr>
+          <w:p>
+            <w:r/>
+            <w:r>
+              <w:rPr>
+                <w:sz w:val="18"/>
+              </w:rPr>
+              <w:t>111/tcp</w:t>
+            </w:r>
+          </w:p>
+        </w:tc>
+        <w:tc>
+          <w:tcPr>
+            <w:tcW w:type="dxa" w:w="2076"/>
+          </w:tcPr>
+          <w:p>
+            <w:r/>
+            <w:r>
+              <w:rPr>
+                <w:sz w:val="18"/>
+              </w:rPr>
+              <w:t>rpcbind</w:t>
+            </w:r>
+          </w:p>
+        </w:tc>
+        <w:tc>
+          <w:tcPr>
+            <w:tcW w:type="dxa" w:w="2076"/>
+          </w:tcPr>
+          <w:p>
+            <w:r/>
+            <w:r>
+              <w:rPr>
+                <w:sz w:val="18"/>
+              </w:rPr>
+              <w:t>RPC #100000</w:t>
+            </w:r>
+          </w:p>
+        </w:tc>
+        <w:tc>
+          <w:tcPr>
+            <w:tcW w:type="dxa" w:w="2076"/>
+          </w:tcPr>
+          <w:p>
+            <w:r/>
+            <w:r>
+              <w:rPr>
+                <w:sz w:val="18"/>
+              </w:rPr>
+              <w:t>Lộ dịch vụ RPC</w:t>
+            </w:r>
+          </w:p>
+        </w:tc>
+      </w:tr>
+      <w:tr>
+        <w:tc>
+          <w:tcPr>
+            <w:tcW w:type="dxa" w:w="2076"/>
+          </w:tcPr>
+          <w:p>
+            <w:r/>
+            <w:r>
+              <w:rPr>
+                <w:sz w:val="18"/>
+              </w:rPr>
+              <w:t>139/tcp</w:t>
+            </w:r>
+          </w:p>
+        </w:tc>
+        <w:tc>
+          <w:tcPr>
+            <w:tcW w:type="dxa" w:w="2076"/>
+          </w:tcPr>
+          <w:p>
+            <w:r/>
+            <w:r>
+              <w:rPr>
+                <w:sz w:val="18"/>
+              </w:rPr>
+              <w:t>netbios-ssn</w:t>
+            </w:r>
+          </w:p>
+        </w:tc>
+        <w:tc>
+          <w:tcPr>
+            <w:tcW w:type="dxa" w:w="2076"/>
+          </w:tcPr>
+          <w:p>
+            <w:r/>
+            <w:r>
+              <w:rPr>
+                <w:sz w:val="18"/>
+              </w:rPr>
+              <w:t>Samba 3.x</w:t>
+            </w:r>
+          </w:p>
+        </w:tc>
+        <w:tc>
+          <w:tcPr>
+            <w:tcW w:type="dxa" w:w="2076"/>
+          </w:tcPr>
+          <w:p>
+            <w:r/>
+            <w:r>
+              <w:rPr>
+                <w:sz w:val="18"/>
+              </w:rPr>
+              <w:t>SMB đời cũ</w:t>
+            </w:r>
+          </w:p>
+        </w:tc>
+      </w:tr>
+      <w:tr>
+        <w:tc>
+          <w:tcPr>
+            <w:tcW w:type="dxa" w:w="2076"/>
+          </w:tcPr>
+          <w:p>
+            <w:r/>
+            <w:r>
+              <w:rPr>
+                <w:sz w:val="18"/>
+              </w:rPr>
+              <w:t>445/tcp</w:t>
+            </w:r>
+          </w:p>
+        </w:tc>
+        <w:tc>
+          <w:tcPr>
+            <w:tcW w:type="dxa" w:w="2076"/>
+          </w:tcPr>
+          <w:p>
+            <w:r/>
+            <w:r>
+              <w:rPr>
+                <w:sz w:val="18"/>
+              </w:rPr>
+              <w:t>microsoft-ds</w:t>
+            </w:r>
+          </w:p>
+        </w:tc>
+        <w:tc>
+          <w:tcPr>
+            <w:tcW w:type="dxa" w:w="2076"/>
+          </w:tcPr>
+          <w:p>
+            <w:r/>
+            <w:r>
+              <w:rPr>
+                <w:sz w:val="18"/>
+              </w:rPr>
+              <w:t>Samba 3.0.20-Debian</w:t>
+            </w:r>
+          </w:p>
+        </w:tc>
+        <w:tc>
+          <w:tcPr>
+            <w:tcW w:type="dxa" w:w="2076"/>
+          </w:tcPr>
+          <w:p>
+            <w:r/>
+            <w:r>
+              <w:rPr>
+                <w:sz w:val="18"/>
+              </w:rPr>
+              <w:t>CVE-2007-2447 (RCE)</w:t>
+            </w:r>
+          </w:p>
+        </w:tc>
+      </w:tr>
+      <w:tr>
+        <w:tc>
+          <w:tcPr>
+            <w:tcW w:type="dxa" w:w="2076"/>
+          </w:tcPr>
+          <w:p>
+            <w:r/>
+            <w:r>
+              <w:rPr>
+                <w:sz w:val="18"/>
+              </w:rPr>
+              <w:t>512/tcp</w:t>
+            </w:r>
+          </w:p>
+        </w:tc>
+        <w:tc>
+          <w:tcPr>
+            <w:tcW w:type="dxa" w:w="2076"/>
+          </w:tcPr>
+          <w:p>
+            <w:r/>
+            <w:r>
+              <w:rPr>
+                <w:sz w:val="18"/>
+              </w:rPr>
+              <w:t>exec</w:t>
+            </w:r>
+          </w:p>
+        </w:tc>
+        <w:tc>
+          <w:tcPr>
+            <w:tcW w:type="dxa" w:w="2076"/>
+          </w:tcPr>
+          <w:p>
+            <w:r/>
+            <w:r>
+              <w:rPr>
+                <w:sz w:val="18"/>
+              </w:rPr>
+              <w:t>netkit-rsh rexecd</w:t>
+            </w:r>
+          </w:p>
+        </w:tc>
+        <w:tc>
+          <w:tcPr>
+            <w:tcW w:type="dxa" w:w="2076"/>
+          </w:tcPr>
+          <w:p>
+            <w:r/>
+            <w:r>
+              <w:rPr>
+                <w:sz w:val="18"/>
+              </w:rPr>
+              <w:t>Dịch vụ r-services, truyền rõ</w:t>
+            </w:r>
+          </w:p>
+        </w:tc>
+      </w:tr>
+      <w:tr>
+        <w:tc>
+          <w:tcPr>
+            <w:tcW w:type="dxa" w:w="2076"/>
+          </w:tcPr>
+          <w:p>
+            <w:r/>
+            <w:r>
+              <w:rPr>
+                <w:sz w:val="18"/>
+              </w:rPr>
+              <w:t>513/tcp</w:t>
+            </w:r>
+          </w:p>
+        </w:tc>
+        <w:tc>
+          <w:tcPr>
+            <w:tcW w:type="dxa" w:w="2076"/>
+          </w:tcPr>
+          <w:p>
+            <w:r/>
+            <w:r>
+              <w:rPr>
+                <w:sz w:val="18"/>
+              </w:rPr>
+              <w:t>login</w:t>
+            </w:r>
+          </w:p>
+        </w:tc>
+        <w:tc>
+          <w:tcPr>
+            <w:tcW w:type="dxa" w:w="2076"/>
+          </w:tcPr>
+          <w:p>
+            <w:r/>
+            <w:r>
+              <w:rPr>
+                <w:sz w:val="18"/>
+              </w:rPr>
+              <w:t>rlogind</w:t>
+            </w:r>
+          </w:p>
+        </w:tc>
+        <w:tc>
+          <w:tcPr>
+            <w:tcW w:type="dxa" w:w="2076"/>
+          </w:tcPr>
+          <w:p>
+            <w:r/>
+            <w:r>
+              <w:rPr>
+                <w:sz w:val="18"/>
+              </w:rPr>
+              <w:t>Tin cậy theo host, không an toàn</w:t>
+            </w:r>
+          </w:p>
+        </w:tc>
+      </w:tr>
+      <w:tr>
+        <w:tc>
+          <w:tcPr>
+            <w:tcW w:type="dxa" w:w="2076"/>
+          </w:tcPr>
+          <w:p>
+            <w:r/>
+            <w:r>
+              <w:rPr>
+                <w:sz w:val="18"/>
+              </w:rPr>
+              <w:t>514/tcp</w:t>
+            </w:r>
+          </w:p>
+        </w:tc>
+        <w:tc>
+          <w:tcPr>
+            <w:tcW w:type="dxa" w:w="2076"/>
+          </w:tcPr>
+          <w:p>
+            <w:r/>
+            <w:r>
+              <w:rPr>
+                <w:sz w:val="18"/>
+              </w:rPr>
+              <w:t>shell</w:t>
+            </w:r>
+          </w:p>
+        </w:tc>
+        <w:tc>
+          <w:tcPr>
+            <w:tcW w:type="dxa" w:w="2076"/>
+          </w:tcPr>
+          <w:p>
+            <w:r/>
+            <w:r>
+              <w:rPr>
+                <w:sz w:val="18"/>
+              </w:rPr>
+              <w:t>rsh (tcpwrapped)</w:t>
+            </w:r>
+          </w:p>
+        </w:tc>
+        <w:tc>
+          <w:tcPr>
+            <w:tcW w:type="dxa" w:w="2076"/>
+          </w:tcPr>
+          <w:p>
+            <w:r/>
+            <w:r>
+              <w:rPr>
+                <w:sz w:val="18"/>
+              </w:rPr>
+              <w:t>Nên gỡ bỏ</w:t>
+            </w:r>
+          </w:p>
+        </w:tc>
+      </w:tr>
+      <w:tr>
+        <w:tc>
+          <w:tcPr>
+            <w:tcW w:type="dxa" w:w="2076"/>
+          </w:tcPr>
+          <w:p>
+            <w:r/>
+            <w:r>
+              <w:rPr>
+                <w:sz w:val="18"/>
+              </w:rPr>
+              <w:t>1099/tcp</w:t>
+            </w:r>
+          </w:p>
+        </w:tc>
+        <w:tc>
+          <w:tcPr>
+            <w:tcW w:type="dxa" w:w="2076"/>
+          </w:tcPr>
+          <w:p>
+            <w:r/>
+            <w:r>
+              <w:rPr>
+                <w:sz w:val="18"/>
+              </w:rPr>
+              <w:t>java-rmi</w:t>
+            </w:r>
+          </w:p>
+        </w:tc>
+        <w:tc>
+          <w:tcPr>
+            <w:tcW w:type="dxa" w:w="2076"/>
+          </w:tcPr>
+          <w:p>
+            <w:r/>
+            <w:r>
+              <w:rPr>
+                <w:sz w:val="18"/>
+              </w:rPr>
+              <w:t>GNU Classpath grmiregistry</w:t>
+            </w:r>
+          </w:p>
+        </w:tc>
+        <w:tc>
+          <w:tcPr>
+            <w:tcW w:type="dxa" w:w="2076"/>
+          </w:tcPr>
+          <w:p>
+            <w:r/>
+            <w:r>
+              <w:rPr>
+                <w:sz w:val="18"/>
+              </w:rPr>
+              <w:t>RMI có thể bị lạm dụng</w:t>
+            </w:r>
+          </w:p>
+        </w:tc>
+      </w:tr>
+      <w:tr>
+        <w:tc>
+          <w:tcPr>
+            <w:tcW w:type="dxa" w:w="2076"/>
+          </w:tcPr>
+          <w:p>
+            <w:r/>
+            <w:r>
+              <w:rPr>
+                <w:sz w:val="18"/>
+              </w:rPr>
+              <w:t>1524/tcp</w:t>
+            </w:r>
+          </w:p>
+        </w:tc>
+        <w:tc>
+          <w:tcPr>
+            <w:tcW w:type="dxa" w:w="2076"/>
+          </w:tcPr>
+          <w:p>
+            <w:r/>
+            <w:r>
+              <w:rPr>
+                <w:sz w:val="18"/>
+              </w:rPr>
+              <w:t>bindshell</w:t>
+            </w:r>
+          </w:p>
+        </w:tc>
+        <w:tc>
+          <w:tcPr>
+            <w:tcW w:type="dxa" w:w="2076"/>
+          </w:tcPr>
+          <w:p>
+            <w:r/>
+            <w:r>
+              <w:rPr>
+                <w:sz w:val="18"/>
+              </w:rPr>
+              <w:t>Metasploitable root shell</w:t>
+            </w:r>
+          </w:p>
+        </w:tc>
+        <w:tc>
+          <w:tcPr>
+            <w:tcW w:type="dxa" w:w="2076"/>
+          </w:tcPr>
+          <w:p>
+            <w:r/>
+            <w:r>
+              <w:rPr>
+                <w:sz w:val="18"/>
+              </w:rPr>
+              <w:t>Backdoor shell quyền root</w:t>
+            </w:r>
+          </w:p>
+        </w:tc>
+      </w:tr>
+      <w:tr>
+        <w:tc>
+          <w:tcPr>
+            <w:tcW w:type="dxa" w:w="2076"/>
+          </w:tcPr>
+          <w:p>
+            <w:r/>
+            <w:r>
+              <w:rPr>
+                <w:sz w:val="18"/>
+              </w:rPr>
+              <w:t>2049/tcp</w:t>
+            </w:r>
+          </w:p>
+        </w:tc>
+        <w:tc>
+          <w:tcPr>
+            <w:tcW w:type="dxa" w:w="2076"/>
+          </w:tcPr>
+          <w:p>
+            <w:r/>
+            <w:r>
+              <w:rPr>
+                <w:sz w:val="18"/>
+              </w:rPr>
+              <w:t>nfs</w:t>
+            </w:r>
+          </w:p>
+        </w:tc>
+        <w:tc>
+          <w:tcPr>
+            <w:tcW w:type="dxa" w:w="2076"/>
+          </w:tcPr>
+          <w:p>
+            <w:r/>
+            <w:r>
+              <w:rPr>
+                <w:sz w:val="18"/>
+              </w:rPr>
+              <w:t>NFS 2-4</w:t>
+            </w:r>
+          </w:p>
+        </w:tc>
+        <w:tc>
+          <w:tcPr>
+            <w:tcW w:type="dxa" w:w="2076"/>
+          </w:tcPr>
+          <w:p>
+            <w:r/>
+            <w:r>
+              <w:rPr>
+                <w:sz w:val="18"/>
+              </w:rPr>
+              <w:t>Chia sẻ file cấu hình sai</w:t>
+            </w:r>
+          </w:p>
+        </w:tc>
+      </w:tr>
+      <w:tr>
+        <w:tc>
+          <w:tcPr>
+            <w:tcW w:type="dxa" w:w="2076"/>
+          </w:tcPr>
+          <w:p>
+            <w:r/>
+            <w:r>
+              <w:rPr>
+                <w:sz w:val="18"/>
+              </w:rPr>
+              <w:t>2121/tcp</w:t>
+            </w:r>
+          </w:p>
+        </w:tc>
+        <w:tc>
+          <w:tcPr>
+            <w:tcW w:type="dxa" w:w="2076"/>
+          </w:tcPr>
+          <w:p>
+            <w:r/>
+            <w:r>
+              <w:rPr>
+                <w:sz w:val="18"/>
+              </w:rPr>
+              <w:t>ftp</w:t>
+            </w:r>
+          </w:p>
+        </w:tc>
+        <w:tc>
+          <w:tcPr>
+            <w:tcW w:type="dxa" w:w="2076"/>
+          </w:tcPr>
+          <w:p>
+            <w:r/>
+            <w:r>
+              <w:rPr>
+                <w:sz w:val="18"/>
+              </w:rPr>
+              <w:t>ProFTPD 1.3.1</w:t>
+            </w:r>
+          </w:p>
+        </w:tc>
+        <w:tc>
+          <w:tcPr>
+            <w:tcW w:type="dxa" w:w="2076"/>
+          </w:tcPr>
+          <w:p>
+            <w:r/>
+            <w:r>
+              <w:rPr>
+                <w:sz w:val="18"/>
+              </w:rPr>
+              <w:t>FTP ở cổng không chuẩn</w:t>
+            </w:r>
+          </w:p>
+        </w:tc>
+      </w:tr>
+      <w:tr>
+        <w:tc>
+          <w:tcPr>
+            <w:tcW w:type="dxa" w:w="2076"/>
+          </w:tcPr>
+          <w:p>
+            <w:r/>
+            <w:r>
+              <w:rPr>
+                <w:sz w:val="18"/>
+              </w:rPr>
+              <w:t>3306/tcp</w:t>
+            </w:r>
+          </w:p>
+        </w:tc>
+        <w:tc>
+          <w:tcPr>
+            <w:tcW w:type="dxa" w:w="2076"/>
+          </w:tcPr>
+          <w:p>
+            <w:r/>
+            <w:r>
+              <w:rPr>
+                <w:sz w:val="18"/>
+              </w:rPr>
+              <w:t>mysql</w:t>
+            </w:r>
+          </w:p>
+        </w:tc>
+        <w:tc>
+          <w:tcPr>
+            <w:tcW w:type="dxa" w:w="2076"/>
+          </w:tcPr>
+          <w:p>
+            <w:r/>
+            <w:r>
+              <w:rPr>
+                <w:sz w:val="18"/>
+              </w:rPr>
+              <w:t>MySQL 5.0.51a-3ubuntu5</w:t>
+            </w:r>
+          </w:p>
+        </w:tc>
+        <w:tc>
+          <w:tcPr>
+            <w:tcW w:type="dxa" w:w="2076"/>
+          </w:tcPr>
+          <w:p>
+            <w:r/>
+            <w:r>
+              <w:rPr>
+                <w:sz w:val="18"/>
+              </w:rPr>
+              <w:t>Tài khoản root yếu/trống</w:t>
+            </w:r>
+          </w:p>
+        </w:tc>
+      </w:tr>
+      <w:tr>
+        <w:tc>
+          <w:tcPr>
+            <w:tcW w:type="dxa" w:w="2076"/>
+          </w:tcPr>
+          <w:p>
+            <w:r/>
+            <w:r>
+              <w:rPr>
+                <w:sz w:val="18"/>
+              </w:rPr>
+              <w:t>5432/tcp</w:t>
+            </w:r>
+          </w:p>
+        </w:tc>
+        <w:tc>
+          <w:tcPr>
+            <w:tcW w:type="dxa" w:w="2076"/>
+          </w:tcPr>
+          <w:p>
+            <w:r/>
+            <w:r>
+              <w:rPr>
+                <w:sz w:val="18"/>
+              </w:rPr>
+              <w:t>postgresql</w:t>
+            </w:r>
+          </w:p>
+        </w:tc>
+        <w:tc>
+          <w:tcPr>
+            <w:tcW w:type="dxa" w:w="2076"/>
+          </w:tcPr>
+          <w:p>
+            <w:r/>
+            <w:r>
+              <w:rPr>
+                <w:sz w:val="18"/>
+              </w:rPr>
+              <w:t>PostgreSQL 8.3.x</w:t>
+            </w:r>
+          </w:p>
+        </w:tc>
+        <w:tc>
+          <w:tcPr>
+            <w:tcW w:type="dxa" w:w="2076"/>
+          </w:tcPr>
+          <w:p>
+            <w:r/>
+            <w:r>
+              <w:rPr>
+                <w:sz w:val="18"/>
+              </w:rPr>
+              <w:t>Mật khẩu mặc định</w:t>
+            </w:r>
+          </w:p>
+        </w:tc>
+      </w:tr>
+      <w:tr>
+        <w:tc>
+          <w:tcPr>
+            <w:tcW w:type="dxa" w:w="2076"/>
+          </w:tcPr>
+          <w:p>
+            <w:r/>
+            <w:r>
+              <w:rPr>
+                <w:sz w:val="18"/>
+              </w:rPr>
+              <w:t>5900/tcp</w:t>
+            </w:r>
+          </w:p>
+        </w:tc>
+        <w:tc>
+          <w:tcPr>
+            <w:tcW w:type="dxa" w:w="2076"/>
+          </w:tcPr>
+          <w:p>
+            <w:r/>
+            <w:r>
+              <w:rPr>
+                <w:sz w:val="18"/>
+              </w:rPr>
+              <w:t>vnc</w:t>
+            </w:r>
+          </w:p>
+        </w:tc>
+        <w:tc>
+          <w:tcPr>
+            <w:tcW w:type="dxa" w:w="2076"/>
+          </w:tcPr>
+          <w:p>
+            <w:r/>
+            <w:r>
+              <w:rPr>
+                <w:sz w:val="18"/>
+              </w:rPr>
+              <w:t>VNC protocol 3.3</w:t>
+            </w:r>
+          </w:p>
+        </w:tc>
+        <w:tc>
+          <w:tcPr>
+            <w:tcW w:type="dxa" w:w="2076"/>
+          </w:tcPr>
+          <w:p>
+            <w:r/>
+            <w:r>
+              <w:rPr>
+                <w:sz w:val="18"/>
+              </w:rPr>
+              <w:t>Mật khẩu VNC yếu</w:t>
+            </w:r>
+          </w:p>
+        </w:tc>
+      </w:tr>
+      <w:tr>
+        <w:tc>
+          <w:tcPr>
+            <w:tcW w:type="dxa" w:w="2076"/>
+          </w:tcPr>
+          <w:p>
+            <w:r/>
+            <w:r>
+              <w:rPr>
+                <w:sz w:val="18"/>
+              </w:rPr>
+              <w:t>6000/tcp</w:t>
+            </w:r>
+          </w:p>
+        </w:tc>
+        <w:tc>
+          <w:tcPr>
+            <w:tcW w:type="dxa" w:w="2076"/>
+          </w:tcPr>
+          <w:p>
+            <w:r/>
+            <w:r>
+              <w:rPr>
+                <w:sz w:val="18"/>
+              </w:rPr>
+              <w:t>X11</w:t>
+            </w:r>
+          </w:p>
+        </w:tc>
+        <w:tc>
+          <w:tcPr>
+            <w:tcW w:type="dxa" w:w="2076"/>
+          </w:tcPr>
+          <w:p>
+            <w:r/>
+            <w:r>
+              <w:rPr>
+                <w:sz w:val="18"/>
+              </w:rPr>
+              <w:t>X11 (access denied)</w:t>
+            </w:r>
+          </w:p>
+        </w:tc>
+        <w:tc>
+          <w:tcPr>
+            <w:tcW w:type="dxa" w:w="2076"/>
+          </w:tcPr>
+          <w:p>
+            <w:r/>
+            <w:r>
+              <w:rPr>
+                <w:sz w:val="18"/>
+              </w:rPr>
+              <w:t>Lộ dịch vụ X</w:t>
+            </w:r>
+          </w:p>
+        </w:tc>
+      </w:tr>
+      <w:tr>
+        <w:tc>
+          <w:tcPr>
+            <w:tcW w:type="dxa" w:w="2076"/>
+          </w:tcPr>
+          <w:p>
+            <w:r/>
+            <w:r>
+              <w:rPr>
+                <w:sz w:val="18"/>
+              </w:rPr>
+              <w:t>6667/tcp</w:t>
+            </w:r>
+          </w:p>
+        </w:tc>
+        <w:tc>
+          <w:tcPr>
+            <w:tcW w:type="dxa" w:w="2076"/>
+          </w:tcPr>
+          <w:p>
+            <w:r/>
+            <w:r>
+              <w:rPr>
+                <w:sz w:val="18"/>
+              </w:rPr>
+              <w:t>irc</w:t>
+            </w:r>
+          </w:p>
+        </w:tc>
+        <w:tc>
+          <w:tcPr>
+            <w:tcW w:type="dxa" w:w="2076"/>
+          </w:tcPr>
+          <w:p>
+            <w:r/>
+            <w:r>
+              <w:rPr>
+                <w:sz w:val="18"/>
+              </w:rPr>
+              <w:t>UnrealIRCd</w:t>
+            </w:r>
+          </w:p>
+        </w:tc>
+        <w:tc>
+          <w:tcPr>
+            <w:tcW w:type="dxa" w:w="2076"/>
+          </w:tcPr>
+          <w:p>
+            <w:r/>
+            <w:r>
+              <w:rPr>
+                <w:sz w:val="18"/>
+              </w:rPr>
+              <w:t>Bản Metasploitable có backdoor</w:t>
+            </w:r>
+          </w:p>
+        </w:tc>
+      </w:tr>
+      <w:tr>
+        <w:tc>
+          <w:tcPr>
+            <w:tcW w:type="dxa" w:w="2076"/>
+          </w:tcPr>
+          <w:p>
+            <w:r/>
+            <w:r>
+              <w:rPr>
+                <w:sz w:val="18"/>
+              </w:rPr>
+              <w:t>8009/tcp</w:t>
+            </w:r>
+          </w:p>
+        </w:tc>
+        <w:tc>
+          <w:tcPr>
+            <w:tcW w:type="dxa" w:w="2076"/>
+          </w:tcPr>
+          <w:p>
+            <w:r/>
+            <w:r>
+              <w:rPr>
+                <w:sz w:val="18"/>
+              </w:rPr>
+              <w:t>ajp13</w:t>
+            </w:r>
+          </w:p>
+        </w:tc>
+        <w:tc>
+          <w:tcPr>
+            <w:tcW w:type="dxa" w:w="2076"/>
+          </w:tcPr>
+          <w:p>
+            <w:r/>
+            <w:r>
+              <w:rPr>
+                <w:sz w:val="18"/>
+              </w:rPr>
+              <w:t>Apache Jserv v1.3</w:t>
+            </w:r>
+          </w:p>
+        </w:tc>
+        <w:tc>
+          <w:tcPr>
+            <w:tcW w:type="dxa" w:w="2076"/>
+          </w:tcPr>
+          <w:p>
+            <w:r/>
+            <w:r>
+              <w:rPr>
+                <w:sz w:val="18"/>
+              </w:rPr>
+              <w:t>Nguy cơ Ghostcat</w:t>
+            </w:r>
+          </w:p>
+        </w:tc>
+      </w:tr>
+      <w:tr>
+        <w:tc>
+          <w:tcPr>
+            <w:tcW w:type="dxa" w:w="2076"/>
+          </w:tcPr>
+          <w:p>
+            <w:r/>
+            <w:r>
+              <w:rPr>
+                <w:sz w:val="18"/>
+              </w:rPr>
+              <w:t>8180/tcp</w:t>
+            </w:r>
+          </w:p>
+        </w:tc>
+        <w:tc>
+          <w:tcPr>
+            <w:tcW w:type="dxa" w:w="2076"/>
+          </w:tcPr>
+          <w:p>
+            <w:r/>
+            <w:r>
+              <w:rPr>
+                <w:sz w:val="18"/>
+              </w:rPr>
+              <w:t>http</w:t>
+            </w:r>
+          </w:p>
+        </w:tc>
+        <w:tc>
+          <w:tcPr>
+            <w:tcW w:type="dxa" w:w="2076"/>
+          </w:tcPr>
+          <w:p>
+            <w:r/>
+            <w:r>
+              <w:rPr>
+                <w:sz w:val="18"/>
+              </w:rPr>
+              <w:t>Apache Tomcat/Coyote JSP 1.1</w:t>
+            </w:r>
+          </w:p>
+        </w:tc>
+        <w:tc>
+          <w:tcPr>
+            <w:tcW w:type="dxa" w:w="2076"/>
+          </w:tcPr>
+          <w:p>
+            <w:r/>
+            <w:r>
+              <w:rPr>
+                <w:sz w:val="18"/>
+              </w:rPr>
+              <w:t>Tài khoản manager mặc định</w:t>
+            </w:r>
+          </w:p>
+        </w:tc>
+      </w:tr>
+    </w:tbl>
+    <w:p/>
+    <w:p>
+      <w:r>
+        <w:rPr>
+          <w:b w:val="0"/>
+          <w:i w:val="0"/>
+        </w:rPr>
+        <w:t>Tổng: 23 cổng open, 977 cổng closed trong 1000 cổng mặc định, 0 cổng filtered (máy đích không bật firewall ở lần quét đầu).</w:t>
+      </w:r>
+    </w:p>
+    <w:p>
+      <w:r>
+        <w:rPr>
+          <w:b/>
+          <w:i w:val="0"/>
+          <w:sz w:val="26"/>
+        </w:rPr>
+        <w:t>K. CHI TIẾT KẾT QUẢ QUÉT UDP (nmap -sU --top-ports 20)</w:t>
+      </w:r>
+    </w:p>
+    <w:tbl>
+      <w:tblPr>
+        <w:tblW w:type="auto" w:w="0"/>
+        <w:tblLook w:firstColumn="1" w:firstRow="1" w:lastColumn="0" w:lastRow="0" w:noHBand="0" w:noVBand="1" w:val="04A0"/>
+        <w:tblBorders>
+          <w:top w:val="single" w:sz="4" w:space="0" w:color="000000"/>
+          <w:left w:val="single" w:sz="4" w:space="0" w:color="000000"/>
+          <w:bottom w:val="single" w:sz="4" w:space="0" w:color="000000"/>
+          <w:right w:val="single" w:sz="4" w:space="0" w:color="000000"/>
+          <w:insideH w:val="single" w:sz="4" w:space="0" w:color="000000"/>
+          <w:insideV w:val="single" w:sz="4" w:space="0" w:color="000000"/>
+        </w:tblBorders>
+      </w:tblPr>
+      <w:tblGrid>
+        <w:gridCol w:w="2076"/>
+        <w:gridCol w:w="2076"/>
+        <w:gridCol w:w="2076"/>
+        <w:gridCol w:w="2076"/>
+      </w:tblGrid>
+      <w:tr>
+        <w:tc>
+          <w:tcPr>
+            <w:tcW w:type="dxa" w:w="2076"/>
+          </w:tcPr>
+          <w:p>
+            <w:r/>
+            <w:r>
+              <w:rPr>
+                <w:b/>
+                <w:sz w:val="18"/>
+              </w:rPr>
+              <w:t>Cổng UDP</w:t>
+            </w:r>
+          </w:p>
+        </w:tc>
+        <w:tc>
+          <w:tcPr>
+            <w:tcW w:type="dxa" w:w="2076"/>
+          </w:tcPr>
+          <w:p>
+            <w:r/>
+            <w:r>
+              <w:rPr>
+                <w:b/>
+                <w:sz w:val="18"/>
+              </w:rPr>
+              <w:t>Trạng thái</w:t>
+            </w:r>
+          </w:p>
+        </w:tc>
+        <w:tc>
+          <w:tcPr>
+            <w:tcW w:type="dxa" w:w="2076"/>
+          </w:tcPr>
+          <w:p>
+            <w:r/>
+            <w:r>
+              <w:rPr>
+                <w:b/>
+                <w:sz w:val="18"/>
+              </w:rPr>
+              <w:t>Dịch vụ</w:t>
+            </w:r>
+          </w:p>
+        </w:tc>
+        <w:tc>
+          <w:tcPr>
+            <w:tcW w:type="dxa" w:w="2076"/>
+          </w:tcPr>
+          <w:p>
+            <w:r/>
+            <w:r>
+              <w:rPr>
+                <w:b/>
+                <w:sz w:val="18"/>
+              </w:rPr>
+              <w:t>Quan sát</w:t>
+            </w:r>
+          </w:p>
+        </w:tc>
+      </w:tr>
+      <w:tr>
+        <w:tc>
+          <w:tcPr>
+            <w:tcW w:type="dxa" w:w="2076"/>
+          </w:tcPr>
+          <w:p>
+            <w:r/>
+            <w:r>
+              <w:rPr>
+                <w:sz w:val="18"/>
+              </w:rPr>
+              <w:t>53</w:t>
+            </w:r>
+          </w:p>
+        </w:tc>
+        <w:tc>
+          <w:tcPr>
+            <w:tcW w:type="dxa" w:w="2076"/>
+          </w:tcPr>
+          <w:p>
+            <w:r/>
+            <w:r>
+              <w:rPr>
+                <w:sz w:val="18"/>
+              </w:rPr>
+              <w:t>open</w:t>
+            </w:r>
+          </w:p>
+        </w:tc>
+        <w:tc>
+          <w:tcPr>
+            <w:tcW w:type="dxa" w:w="2076"/>
+          </w:tcPr>
+          <w:p>
+            <w:r/>
+            <w:r>
+              <w:rPr>
+                <w:sz w:val="18"/>
+              </w:rPr>
+              <w:t>domain</w:t>
+            </w:r>
+          </w:p>
+        </w:tc>
+        <w:tc>
+          <w:tcPr>
+            <w:tcW w:type="dxa" w:w="2076"/>
+          </w:tcPr>
+          <w:p>
+            <w:r/>
+            <w:r>
+              <w:rPr>
+                <w:sz w:val="18"/>
+              </w:rPr>
+              <w:t>DNS đang chạy, phản hồi</w:t>
+            </w:r>
+          </w:p>
+        </w:tc>
+      </w:tr>
+      <w:tr>
+        <w:tc>
+          <w:tcPr>
+            <w:tcW w:type="dxa" w:w="2076"/>
+          </w:tcPr>
+          <w:p>
+            <w:r/>
+            <w:r>
+              <w:rPr>
+                <w:sz w:val="18"/>
+              </w:rPr>
+              <w:t>137</w:t>
+            </w:r>
+          </w:p>
+        </w:tc>
+        <w:tc>
+          <w:tcPr>
+            <w:tcW w:type="dxa" w:w="2076"/>
+          </w:tcPr>
+          <w:p>
+            <w:r/>
+            <w:r>
+              <w:rPr>
+                <w:sz w:val="18"/>
+              </w:rPr>
+              <w:t>open</w:t>
+            </w:r>
+          </w:p>
+        </w:tc>
+        <w:tc>
+          <w:tcPr>
+            <w:tcW w:type="dxa" w:w="2076"/>
+          </w:tcPr>
+          <w:p>
+            <w:r/>
+            <w:r>
+              <w:rPr>
+                <w:sz w:val="18"/>
+              </w:rPr>
+              <w:t>netbios-ns</w:t>
+            </w:r>
+          </w:p>
+        </w:tc>
+        <w:tc>
+          <w:tcPr>
+            <w:tcW w:type="dxa" w:w="2076"/>
+          </w:tcPr>
+          <w:p>
+            <w:r/>
+            <w:r>
+              <w:rPr>
+                <w:sz w:val="18"/>
+              </w:rPr>
+              <w:t>NetBIOS name service</w:t>
+            </w:r>
+          </w:p>
+        </w:tc>
+      </w:tr>
+      <w:tr>
+        <w:tc>
+          <w:tcPr>
+            <w:tcW w:type="dxa" w:w="2076"/>
+          </w:tcPr>
+          <w:p>
+            <w:r/>
+            <w:r>
+              <w:rPr>
+                <w:sz w:val="18"/>
+              </w:rPr>
+              <w:t>68</w:t>
+            </w:r>
+          </w:p>
+        </w:tc>
+        <w:tc>
+          <w:tcPr>
+            <w:tcW w:type="dxa" w:w="2076"/>
+          </w:tcPr>
+          <w:p>
+            <w:r/>
+            <w:r>
+              <w:rPr>
+                <w:sz w:val="18"/>
+              </w:rPr>
+              <w:t>open|filtered</w:t>
+            </w:r>
+          </w:p>
+        </w:tc>
+        <w:tc>
+          <w:tcPr>
+            <w:tcW w:type="dxa" w:w="2076"/>
+          </w:tcPr>
+          <w:p>
+            <w:r/>
+            <w:r>
+              <w:rPr>
+                <w:sz w:val="18"/>
+              </w:rPr>
+              <w:t>dhcpc</w:t>
+            </w:r>
+          </w:p>
+        </w:tc>
+        <w:tc>
+          <w:tcPr>
+            <w:tcW w:type="dxa" w:w="2076"/>
+          </w:tcPr>
+          <w:p>
+            <w:r/>
+            <w:r>
+              <w:rPr>
+                <w:sz w:val="18"/>
+              </w:rPr>
+              <w:t>Không phản hồi, không phân biệt được</w:t>
+            </w:r>
+          </w:p>
+        </w:tc>
+      </w:tr>
+      <w:tr>
+        <w:tc>
+          <w:tcPr>
+            <w:tcW w:type="dxa" w:w="2076"/>
+          </w:tcPr>
+          <w:p>
+            <w:r/>
+            <w:r>
+              <w:rPr>
+                <w:sz w:val="18"/>
+              </w:rPr>
+              <w:t>69</w:t>
+            </w:r>
+          </w:p>
+        </w:tc>
+        <w:tc>
+          <w:tcPr>
+            <w:tcW w:type="dxa" w:w="2076"/>
+          </w:tcPr>
+          <w:p>
+            <w:r/>
+            <w:r>
+              <w:rPr>
+                <w:sz w:val="18"/>
+              </w:rPr>
+              <w:t>open|filtered</w:t>
+            </w:r>
+          </w:p>
+        </w:tc>
+        <w:tc>
+          <w:tcPr>
+            <w:tcW w:type="dxa" w:w="2076"/>
+          </w:tcPr>
+          <w:p>
+            <w:r/>
+            <w:r>
+              <w:rPr>
+                <w:sz w:val="18"/>
+              </w:rPr>
+              <w:t>tftp</w:t>
+            </w:r>
+          </w:p>
+        </w:tc>
+        <w:tc>
+          <w:tcPr>
+            <w:tcW w:type="dxa" w:w="2076"/>
+          </w:tcPr>
+          <w:p>
+            <w:r/>
+            <w:r>
+              <w:rPr>
+                <w:sz w:val="18"/>
+              </w:rPr>
+              <w:t>Có thể mở hoặc bị lọc</w:t>
+            </w:r>
+          </w:p>
+        </w:tc>
+      </w:tr>
+      <w:tr>
+        <w:tc>
+          <w:tcPr>
+            <w:tcW w:type="dxa" w:w="2076"/>
+          </w:tcPr>
+          <w:p>
+            <w:r/>
+            <w:r>
+              <w:rPr>
+                <w:sz w:val="18"/>
+              </w:rPr>
+              <w:t>138</w:t>
+            </w:r>
+          </w:p>
+        </w:tc>
+        <w:tc>
+          <w:tcPr>
+            <w:tcW w:type="dxa" w:w="2076"/>
+          </w:tcPr>
+          <w:p>
+            <w:r/>
+            <w:r>
+              <w:rPr>
+                <w:sz w:val="18"/>
+              </w:rPr>
+              <w:t>open|filtered</w:t>
+            </w:r>
+          </w:p>
+        </w:tc>
+        <w:tc>
+          <w:tcPr>
+            <w:tcW w:type="dxa" w:w="2076"/>
+          </w:tcPr>
+          <w:p>
+            <w:r/>
+            <w:r>
+              <w:rPr>
+                <w:sz w:val="18"/>
+              </w:rPr>
+              <w:t>netbios-dgm</w:t>
+            </w:r>
+          </w:p>
+        </w:tc>
+        <w:tc>
+          <w:tcPr>
+            <w:tcW w:type="dxa" w:w="2076"/>
+          </w:tcPr>
+          <w:p>
+            <w:r/>
+            <w:r>
+              <w:rPr>
+                <w:sz w:val="18"/>
+              </w:rPr>
+              <w:t>Không phản hồi</w:t>
+            </w:r>
+          </w:p>
+        </w:tc>
+      </w:tr>
+      <w:tr>
+        <w:tc>
+          <w:tcPr>
+            <w:tcW w:type="dxa" w:w="2076"/>
+          </w:tcPr>
+          <w:p>
+            <w:r/>
+            <w:r>
+              <w:rPr>
+                <w:sz w:val="18"/>
+              </w:rPr>
+              <w:t>67,123,135,139,161,162,445,500,514,520,631,1434,1900,4500,49152</w:t>
+            </w:r>
+          </w:p>
+        </w:tc>
+        <w:tc>
+          <w:tcPr>
+            <w:tcW w:type="dxa" w:w="2076"/>
+          </w:tcPr>
+          <w:p>
+            <w:r/>
+            <w:r>
+              <w:rPr>
+                <w:sz w:val="18"/>
+              </w:rPr>
+              <w:t>closed</w:t>
+            </w:r>
+          </w:p>
+        </w:tc>
+        <w:tc>
+          <w:tcPr>
+            <w:tcW w:type="dxa" w:w="2076"/>
+          </w:tcPr>
+          <w:p>
+            <w:r/>
+            <w:r>
+              <w:rPr>
+                <w:sz w:val="18"/>
+              </w:rPr>
+              <w:t>nhiều</w:t>
+            </w:r>
+          </w:p>
+        </w:tc>
+        <w:tc>
+          <w:tcPr>
+            <w:tcW w:type="dxa" w:w="2076"/>
+          </w:tcPr>
+          <w:p>
+            <w:r/>
+            <w:r>
+              <w:rPr>
+                <w:sz w:val="18"/>
+              </w:rPr>
+              <w:t>Máy trả ICMP port unreachable</w:t>
+            </w:r>
+          </w:p>
+        </w:tc>
+      </w:tr>
+    </w:tbl>
+    <w:p/>
+    <w:p>
+      <w:r>
+        <w:rPr>
+          <w:b w:val="0"/>
+          <w:i w:val="0"/>
+        </w:rPr>
+        <w:t>UDP chậm và nhiều open|filtered vì UDP không có bắt tay; cổng mở thường im lặng, trùng với trạng thái bị firewall chặn.</w:t>
+      </w:r>
+    </w:p>
+    <w:p>
+      <w:r>
+        <w:rPr>
+          <w:b/>
+          <w:i w:val="0"/>
+          <w:sz w:val="26"/>
+        </w:rPr>
+        <w:t>L. OS DETECTION VÀ TRACEROUTE</w:t>
+      </w:r>
+    </w:p>
+    <w:p>
+      <w:r>
+        <w:rPr>
+          <w:b w:val="0"/>
+          <w:i w:val="0"/>
+        </w:rPr>
+        <w:t>Kết quả nmap -O: Device type general purpose; Running Linux 2.6.X; OS CPE cpe:/o:linux:linux_kernel:2.6; OS details Linux 2.6.9 - 2.6.33. Đây là phỏng đoán theo xác suất dựa trên TCP/IP stack, cho một khoảng phiên bản chứ không phải con số tuyệt đối. Traceroute: Network Distance 1 hop (192.168.226.134) — máy đích nằm cùng mạng LAN ảo với máy quét.</w:t>
+      </w:r>
+    </w:p>
+    <w:p>
+      <w:r>
+        <w:rPr>
+          <w:b/>
+          <w:i w:val="0"/>
+          <w:sz w:val="26"/>
+        </w:rPr>
+        <w:t>M. ÁNH XẠ LỖ HỔNG (CVE) THEO DỊCH VỤ</w:t>
+      </w:r>
+    </w:p>
+    <w:p>
+      <w:r>
+        <w:rPr>
+          <w:b w:val="0"/>
+          <w:i w:val="0"/>
+        </w:rPr>
+        <w:t>Từ phiên bản do -sV nhận diện, tra cứu các CVE tiêu biểu đã công bố của Metasploitable 2 (chỉ để đánh giá rủi ro, không khai thác):</w:t>
+      </w:r>
+    </w:p>
+    <w:tbl>
+      <w:tblPr>
+        <w:tblW w:type="auto" w:w="0"/>
+        <w:tblLook w:firstColumn="1" w:firstRow="1" w:lastColumn="0" w:lastRow="0" w:noHBand="0" w:noVBand="1" w:val="04A0"/>
+        <w:tblBorders>
+          <w:top w:val="single" w:sz="4" w:space="0" w:color="000000"/>
+          <w:left w:val="single" w:sz="4" w:space="0" w:color="000000"/>
+          <w:bottom w:val="single" w:sz="4" w:space="0" w:color="000000"/>
+          <w:right w:val="single" w:sz="4" w:space="0" w:color="000000"/>
+          <w:insideH w:val="single" w:sz="4" w:space="0" w:color="000000"/>
+          <w:insideV w:val="single" w:sz="4" w:space="0" w:color="000000"/>
+        </w:tblBorders>
+      </w:tblPr>
+      <w:tblGrid>
+        <w:gridCol w:w="2769"/>
+        <w:gridCol w:w="2769"/>
+        <w:gridCol w:w="2769"/>
+      </w:tblGrid>
+      <w:tr>
+        <w:tc>
+          <w:tcPr>
+            <w:tcW w:type="dxa" w:w="2769"/>
+          </w:tcPr>
+          <w:p>
+            <w:r/>
+            <w:r>
+              <w:rPr>
+                <w:b/>
+                <w:sz w:val="18"/>
+              </w:rPr>
+              <w:t>Dịch vụ / phiên bản</w:t>
+            </w:r>
+          </w:p>
+        </w:tc>
+        <w:tc>
+          <w:tcPr>
+            <w:tcW w:type="dxa" w:w="2769"/>
+          </w:tcPr>
+          <w:p>
+            <w:r/>
+            <w:r>
+              <w:rPr>
+                <w:b/>
+                <w:sz w:val="18"/>
+              </w:rPr>
+              <w:t>CVE tiêu biểu</w:t>
+            </w:r>
+          </w:p>
+        </w:tc>
+        <w:tc>
+          <w:tcPr>
+            <w:tcW w:type="dxa" w:w="2769"/>
+          </w:tcPr>
+          <w:p>
+            <w:r/>
+            <w:r>
+              <w:rPr>
+                <w:b/>
+                <w:sz w:val="18"/>
+              </w:rPr>
+              <w:t>Mô tả rủi ro</w:t>
+            </w:r>
+          </w:p>
+        </w:tc>
+      </w:tr>
+      <w:tr>
+        <w:tc>
+          <w:tcPr>
+            <w:tcW w:type="dxa" w:w="2769"/>
+          </w:tcPr>
+          <w:p>
+            <w:r/>
+            <w:r>
+              <w:rPr>
+                <w:sz w:val="18"/>
+              </w:rPr>
+              <w:t>vsftpd 2.3.4</w:t>
+            </w:r>
+          </w:p>
+        </w:tc>
+        <w:tc>
+          <w:tcPr>
+            <w:tcW w:type="dxa" w:w="2769"/>
+          </w:tcPr>
+          <w:p>
+            <w:r/>
+            <w:r>
+              <w:rPr>
+                <w:sz w:val="18"/>
+              </w:rPr>
+              <w:t>CVE-2011-2523</w:t>
+            </w:r>
+          </w:p>
+        </w:tc>
+        <w:tc>
+          <w:tcPr>
+            <w:tcW w:type="dxa" w:w="2769"/>
+          </w:tcPr>
+          <w:p>
+            <w:r/>
+            <w:r>
+              <w:rPr>
+                <w:sz w:val="18"/>
+              </w:rPr>
+              <w:t>Backdoor mở shell khi username chứa ':)'</w:t>
+            </w:r>
+          </w:p>
+        </w:tc>
+      </w:tr>
+      <w:tr>
+        <w:tc>
+          <w:tcPr>
+            <w:tcW w:type="dxa" w:w="2769"/>
+          </w:tcPr>
+          <w:p>
+            <w:r/>
+            <w:r>
+              <w:rPr>
+                <w:sz w:val="18"/>
+              </w:rPr>
+              <w:t>Samba 3.0.20</w:t>
+            </w:r>
+          </w:p>
+        </w:tc>
+        <w:tc>
+          <w:tcPr>
+            <w:tcW w:type="dxa" w:w="2769"/>
+          </w:tcPr>
+          <w:p>
+            <w:r/>
+            <w:r>
+              <w:rPr>
+                <w:sz w:val="18"/>
+              </w:rPr>
+              <w:t>CVE-2007-2447</w:t>
+            </w:r>
+          </w:p>
+        </w:tc>
+        <w:tc>
+          <w:tcPr>
+            <w:tcW w:type="dxa" w:w="2769"/>
+          </w:tcPr>
+          <w:p>
+            <w:r/>
+            <w:r>
+              <w:rPr>
+                <w:sz w:val="18"/>
+              </w:rPr>
+              <w:t>Thực thi lệnh từ xa qua tham số username map script</w:t>
+            </w:r>
+          </w:p>
+        </w:tc>
+      </w:tr>
+      <w:tr>
+        <w:tc>
+          <w:tcPr>
+            <w:tcW w:type="dxa" w:w="2769"/>
+          </w:tcPr>
+          <w:p>
+            <w:r/>
+            <w:r>
+              <w:rPr>
+                <w:sz w:val="18"/>
+              </w:rPr>
+              <w:t>UnrealIRCd (6667)</w:t>
+            </w:r>
+          </w:p>
+        </w:tc>
+        <w:tc>
+          <w:tcPr>
+            <w:tcW w:type="dxa" w:w="2769"/>
+          </w:tcPr>
+          <w:p>
+            <w:r/>
+            <w:r>
+              <w:rPr>
+                <w:sz w:val="18"/>
+              </w:rPr>
+              <w:t>CVE-2010-2075</w:t>
+            </w:r>
+          </w:p>
+        </w:tc>
+        <w:tc>
+          <w:tcPr>
+            <w:tcW w:type="dxa" w:w="2769"/>
+          </w:tcPr>
+          <w:p>
+            <w:r/>
+            <w:r>
+              <w:rPr>
+                <w:sz w:val="18"/>
+              </w:rPr>
+              <w:t>Backdoor thực thi lệnh trong bản phát tán bị chèn mã</w:t>
+            </w:r>
+          </w:p>
+        </w:tc>
+      </w:tr>
+      <w:tr>
+        <w:tc>
+          <w:tcPr>
+            <w:tcW w:type="dxa" w:w="2769"/>
+          </w:tcPr>
+          <w:p>
+            <w:r/>
+            <w:r>
+              <w:rPr>
+                <w:sz w:val="18"/>
+              </w:rPr>
+              <w:t>distccd (3632)</w:t>
+            </w:r>
+          </w:p>
+        </w:tc>
+        <w:tc>
+          <w:tcPr>
+            <w:tcW w:type="dxa" w:w="2769"/>
+          </w:tcPr>
+          <w:p>
+            <w:r/>
+            <w:r>
+              <w:rPr>
+                <w:sz w:val="18"/>
+              </w:rPr>
+              <w:t>CVE-2004-2687</w:t>
+            </w:r>
+          </w:p>
+        </w:tc>
+        <w:tc>
+          <w:tcPr>
+            <w:tcW w:type="dxa" w:w="2769"/>
+          </w:tcPr>
+          <w:p>
+            <w:r/>
+            <w:r>
+              <w:rPr>
+                <w:sz w:val="18"/>
+              </w:rPr>
+              <w:t>Thực thi lệnh từ xa qua distcc cấu hình mở</w:t>
+            </w:r>
+          </w:p>
+        </w:tc>
+      </w:tr>
+      <w:tr>
+        <w:tc>
+          <w:tcPr>
+            <w:tcW w:type="dxa" w:w="2769"/>
+          </w:tcPr>
+          <w:p>
+            <w:r/>
+            <w:r>
+              <w:rPr>
+                <w:sz w:val="18"/>
+              </w:rPr>
+              <w:t>Apache 2.2.8 / BIND 9.4.2</w:t>
+            </w:r>
+          </w:p>
+        </w:tc>
+        <w:tc>
+          <w:tcPr>
+            <w:tcW w:type="dxa" w:w="2769"/>
+          </w:tcPr>
+          <w:p>
+            <w:r/>
+            <w:r>
+              <w:rPr>
+                <w:sz w:val="18"/>
+              </w:rPr>
+              <w:t>Nhiều CVE tích lũy</w:t>
+            </w:r>
+          </w:p>
+        </w:tc>
+        <w:tc>
+          <w:tcPr>
+            <w:tcW w:type="dxa" w:w="2769"/>
+          </w:tcPr>
+          <w:p>
+            <w:r/>
+            <w:r>
+              <w:rPr>
+                <w:sz w:val="18"/>
+              </w:rPr>
+              <w:t>Phần mềm đã hết hỗ trợ (EOL)</w:t>
+            </w:r>
+          </w:p>
+        </w:tc>
+      </w:tr>
+      <w:tr>
+        <w:tc>
+          <w:tcPr>
+            <w:tcW w:type="dxa" w:w="2769"/>
+          </w:tcPr>
+          <w:p>
+            <w:r/>
+            <w:r>
+              <w:rPr>
+                <w:sz w:val="18"/>
+              </w:rPr>
+              <w:t>Tomcat (8180) / MySQL / PostgreSQL / VNC</w:t>
+            </w:r>
+          </w:p>
+        </w:tc>
+        <w:tc>
+          <w:tcPr>
+            <w:tcW w:type="dxa" w:w="2769"/>
+          </w:tcPr>
+          <w:p>
+            <w:r/>
+            <w:r>
+              <w:rPr>
+                <w:sz w:val="18"/>
+              </w:rPr>
+              <w:t>Tài khoản mặc định/yếu</w:t>
+            </w:r>
+          </w:p>
+        </w:tc>
+        <w:tc>
+          <w:tcPr>
+            <w:tcW w:type="dxa" w:w="2769"/>
+          </w:tcPr>
+          <w:p>
+            <w:r/>
+            <w:r>
+              <w:rPr>
+                <w:sz w:val="18"/>
+              </w:rPr>
+              <w:t>Đăng nhập bằng mật khẩu mặc định hoặc trống</w:t>
+            </w:r>
+          </w:p>
+        </w:tc>
+      </w:tr>
+      <w:tr>
+        <w:tc>
+          <w:tcPr>
+            <w:tcW w:type="dxa" w:w="2769"/>
+          </w:tcPr>
+          <w:p>
+            <w:r/>
+            <w:r>
+              <w:rPr>
+                <w:sz w:val="18"/>
+              </w:rPr>
+              <w:t>r-services 512-514, telnet 23</w:t>
+            </w:r>
+          </w:p>
+        </w:tc>
+        <w:tc>
+          <w:tcPr>
+            <w:tcW w:type="dxa" w:w="2769"/>
+          </w:tcPr>
+          <w:p>
+            <w:r/>
+            <w:r>
+              <w:rPr>
+                <w:sz w:val="18"/>
+              </w:rPr>
+              <w:t>Thiết kế không an toàn</w:t>
+            </w:r>
+          </w:p>
+        </w:tc>
+        <w:tc>
+          <w:tcPr>
+            <w:tcW w:type="dxa" w:w="2769"/>
+          </w:tcPr>
+          <w:p>
+            <w:r/>
+            <w:r>
+              <w:rPr>
+                <w:sz w:val="18"/>
+              </w:rPr>
+              <w:t>Truyền rõ, xác thực theo host dễ giả mạo</w:t>
+            </w:r>
+          </w:p>
+        </w:tc>
+      </w:tr>
+    </w:tbl>
+    <w:p/>
+    <w:p>
+      <w:r>
+        <w:rPr>
+          <w:b w:val="0"/>
+          <w:i w:val="0"/>
+        </w:rPr>
+        <w:t>Lưu ý: NSE smb-vuln-ms17-010 KHÔNG báo VULNERABLE vì máy chạy Samba (Linux), không phải SMBv1 của Windows — không được suy ra là máy an toàn, vì Samba 3.0.20 vẫn dính CVE-2007-2447.</w:t>
+      </w:r>
+    </w:p>
+    <w:p>
+      <w:r>
+        <w:rPr>
+          <w:b/>
+          <w:i w:val="0"/>
+          <w:sz w:val="26"/>
+        </w:rPr>
+        <w:t>N. PHÂN TÍCH VÀ NHẬN XÉT</w:t>
+      </w:r>
+    </w:p>
+    <w:p>
+      <w:r>
+        <w:rPr>
+          <w:b w:val="0"/>
+          <w:i w:val="0"/>
+        </w:rPr>
+        <w:t>1. Host discovery -sn phát hiện 5 host up; cần đối chiếu với số VM đang bật để loại trừ adapter máy thật, NAT gateway và DHCP — tránh nhầm thành máy mục tiêu.</w:t>
+      </w:r>
+    </w:p>
+    <w:p>
+      <w:r>
+        <w:rPr>
+          <w:b w:val="0"/>
+          <w:i w:val="0"/>
+        </w:rPr>
+        <w:t>2. -sT và -sS cho cùng 23 cổng open nhưng cơ chế khác nhau: -sT hoàn tất bắt tay 3 bước (dễ bị ghi log), -sS half-open (nhanh, ít log, cần root). Thời gian chênh lệch nhỏ trên LAN ảo (0,66s so với 0,74s).</w:t>
+      </w:r>
+    </w:p>
+    <w:p>
+      <w:r>
+        <w:rPr>
+          <w:b w:val="0"/>
+          <w:i w:val="0"/>
+        </w:rPr>
+        <w:t>3. FIN/Xmas/NULL cho 23 cổng open|filtered vì Linux tuân thủ RFC 793 (cổng mở im lặng); không được đọc open|filtered thành open.</w:t>
+      </w:r>
+    </w:p>
+    <w:p>
+      <w:r>
+        <w:rPr>
+          <w:b w:val="0"/>
+          <w:i w:val="0"/>
+        </w:rPr>
+        <w:t>4. ACK scan cho 1000 cổng unfiltered, chứng tỏ không có firewall có trạng thái; sau hardening, ACK tới 21/23 sẽ thành filtered.</w:t>
+      </w:r>
+    </w:p>
+    <w:p>
+      <w:r>
+        <w:rPr>
+          <w:b w:val="0"/>
+          <w:i w:val="0"/>
+        </w:rPr>
+        <w:t>5. -sV là bước quan trọng nhất cho quản lý lỗ hổng: biết đúng phiên bản mới tra được CVE; nhiều dịch vụ chạy ở cổng không chuẩn (Tomcat 8180, ProFTPD 2121, distccd 3632) nên không thể chỉ dựa vào số cổng.</w:t>
+      </w:r>
+    </w:p>
+    <w:p>
+      <w:r>
+        <w:rPr>
+          <w:b w:val="0"/>
+          <w:i w:val="0"/>
+        </w:rPr>
+        <w:t>6. Before/After hardening chứng minh hiệu quả bằng số liệu: DROP cổng 21 và 23 làm số cổng open giảm 3→1 và filtered tăng 0→2, cổng 22 vẫn mở đúng như mong đợi.</w:t>
+      </w:r>
+    </w:p>
+    <w:p>
+      <w:r>
+        <w:rPr>
+          <w:b/>
+          <w:i w:val="0"/>
+          <w:sz w:val="26"/>
+        </w:rPr>
+        <w:t>O. KẾT LUẬN VÀ KHUYẾN NGHỊ PHÒNG THỦ</w:t>
+      </w:r>
+    </w:p>
+    <w:p>
+      <w:r>
+        <w:rPr>
+          <w:b w:val="0"/>
+          <w:i w:val="0"/>
+        </w:rPr>
+        <w:t>Metasploitable 2 là máy cố ý nhiều lỗ hổng: 23 cổng TCP mở với hàng loạt dịch vụ đời cũ, truyền rõ và tài khoản mặc định. Đánh giá bằng Nmap cho thấy bề mặt tấn công rất rộng. Các biện pháp giảm bề mặt tấn công (không dựa vào ẩn mình trước Nmap):</w:t>
+      </w:r>
+    </w:p>
+    <w:p>
+      <w:r>
+        <w:rPr>
+          <w:b w:val="0"/>
+          <w:i w:val="0"/>
+        </w:rPr>
+        <w:t>• Gỡ/tắt dịch vụ không cần thiết: Telnet (23), r-services (512-514), bindshell (1524), distccd (3632), các dịch vụ IRC/VNC không dùng.</w:t>
+      </w:r>
+    </w:p>
+    <w:p>
+      <w:r>
+        <w:rPr>
+          <w:b w:val="0"/>
+          <w:i w:val="0"/>
+        </w:rPr>
+        <w:t>• Áp firewall mặc định từ chối (default deny), chỉ mở cổng cần và chỉ cho dải IP hợp lệ; ví dụ SSH chỉ mở cho mạng quản trị, MySQL chỉ nghe 127.0.0.1.</w:t>
+      </w:r>
+    </w:p>
+    <w:p>
+      <w:r>
+        <w:rPr>
+          <w:b w:val="0"/>
+          <w:i w:val="0"/>
+        </w:rPr>
+        <w:t>• Thay giao thức truyền rõ bằng giao thức mã hóa: SSH thay Telnet, SFTP thay FTP.</w:t>
+      </w:r>
+    </w:p>
+    <w:p>
+      <w:r>
+        <w:rPr>
+          <w:b w:val="0"/>
+          <w:i w:val="0"/>
+        </w:rPr>
+        <w:t>• Cập nhật/vá phần mềm: nâng cấp vsftpd, OpenSSH, Samba, Apache, Tomcat lên bản còn hỗ trợ; đổi/gỡ tài khoản mặc định (root MySQL, manager Tomcat).</w:t>
+      </w:r>
+    </w:p>
+    <w:p>
+      <w:r>
+        <w:rPr>
+          <w:b w:val="0"/>
+          <w:i w:val="0"/>
+        </w:rPr>
+        <w:t>• Giám sát và ghi log tập trung để phát hiện sớm hành vi quét/khai thác.</w:t>
+      </w:r>
+    </w:p>
+    <w:p>
+      <w:r>
+        <w:rPr>
+          <w:b w:val="0"/>
+          <w:i w:val="0"/>
+        </w:rPr>
+        <w:t>Bài lab chỉ thực hiện trên máy ảo của chính sinh viên trong mạng cô lập, phục vụ học tập và nghiên cứu, không quét hệ thống bên ngoài.</w:t>
       </w:r>
     </w:p>
     <w:p>

</xml_diff>